<commit_message>
Điền thông tin Bên A (SKD INVEST) vào hợp đồng bỏ Xưởng 2
Co-Authored-By: Claude Opus 5.5 <noreply@anthropic.com>
Claude-Session: https://claude.ai/code/session_01CuX5Gma6ZQnfcApGLH6XHu
</commit_message>
<xml_diff>
--- a/HD-Nha-may-nhua-bo-X2-BG-09-10-2026.docx
+++ b/HD-Nha-may-nhua-bo-X2-BG-09-10-2026.docx
@@ -1664,21 +1664,21 @@
           <w:sz w:val="26"/>
           <w:szCs w:val="26"/>
         </w:rPr>
-        <w:t>BÊN GIAO TH</w:t>
-      </w:r>
-      <w:r>
-        <w:rPr>
-          <w:sz w:val="26"/>
-          <w:szCs w:val="26"/>
-        </w:rPr>
-        <w:t>Ầ</w:t>
-      </w:r>
-      <w:r>
-        <w:rPr>
-          <w:sz w:val="26"/>
-          <w:szCs w:val="26"/>
-        </w:rPr>
-        <w:t>U (BÊN A): ...................................................................................</w:t>
+        <w:t xml:space="preserve">BÊN GIAO THẦU (BÊN A): </w:t>
+      </w:r>
+      <w:r>
+        <w:rPr>
+          <w:sz w:val="26"/>
+          <w:szCs w:val="26"/>
+        </w:rPr>
+        <w:t>CÔNG TY TNHH SẢN XUẤT THƯƠNG MẠI VÀ DỊCH VỤ SKD INVEST</w:t>
+      </w:r>
+      <w:r>
+        <w:rPr>
+          <w:sz w:val="26"/>
+          <w:szCs w:val="26"/>
+        </w:rPr>
+        <w:t/>
       </w:r>
     </w:p>
     <w:tbl>
@@ -1767,7 +1767,7 @@
                 <w:sz w:val="26"/>
                 <w:szCs w:val="26"/>
               </w:rPr>
-              <w:t>: ...................................................................................................</w:t>
+              <w:t>: Khu nhà xưởng Công ty TNHH Densta Việt Nam, KCN Tân Quang, xã Tân Quang, huyện Văn Lâm, tỉnh Hưng Yên, Việt Nam</w:t>
             </w:r>
           </w:p>
         </w:tc>
@@ -1842,7 +1842,7 @@
                 <w:sz w:val="26"/>
                 <w:szCs w:val="26"/>
               </w:rPr>
-              <w:t>: ...................................................................................................</w:t>
+              <w:t>: 0901176739</w:t>
             </w:r>
           </w:p>
         </w:tc>
@@ -1917,7 +1917,7 @@
                 <w:sz w:val="26"/>
                 <w:szCs w:val="26"/>
               </w:rPr>
-              <w:t>: ...................................................................................................</w:t>
+              <w:t>: 0912439083</w:t>
             </w:r>
           </w:p>
         </w:tc>
@@ -1992,7 +1992,7 @@
                 <w:sz w:val="26"/>
                 <w:szCs w:val="26"/>
               </w:rPr>
-              <w:t>: ...................................................................................................</w:t>
+              <w:t>: namduong72@gmail.com</w:t>
             </w:r>
           </w:p>
         </w:tc>
@@ -2142,7 +2142,7 @@
                 <w:sz w:val="26"/>
                 <w:szCs w:val="26"/>
               </w:rPr>
-              <w:t>: Ông/Bà ............................................ Chức vụ: .............................</w:t>
+              <w:t>: Ông NGÔ NAM DƯƠNG            Chức vụ: Giám đốc</w:t>
             </w:r>
           </w:p>
         </w:tc>

</xml_diff>